<commit_message>
Frontend round 2, 22/22 E2E on the live stack, refreshed evidence, deck and Word docs
Frontend (Frontend Developer agent): honest framing (realistic 90.2% headline, 99.0% ceiling),
business-case table from /api/roi, new Stock & routes page, delay-alert forecast fields,
per-result "API offline" labels, demo-token header, offline snapshot regenerated from
findings.json. Integration: 22/22 Playwright tests pass against the production build and live
API (two tests updated for the new intake rule and an exact region match). Evidence refreshed:
backend 106 tests / 93% coverage, frontend 15 tests. Screenshots, pitch deck and Word downloads
rebuilt with the corrected numbers.

Co-Authored-By: Claude Opus 5.5 <noreply@anthropic.com>
Claude-Session: https://claude.ai/code/session_018mJx5VLNFyHg3anBqqcAy7
</commit_message>
<xml_diff>
--- a/docs/downloads/01-what-the-judges-want.docx
+++ b/docs/downloads/01-what-the-judges-want.docx
@@ -42,7 +42,7 @@
               <a:graphicData uri="http://schemas.openxmlformats.org/drawingml/2006/picture">
                 <pic:pic>
                   <pic:nvPicPr>
-                    <pic:cNvPr descr="/tmp/tmpb7fcviaa/01-what-the-judges-want-1.png" id="22" name="Picture"/>
+                    <pic:cNvPr descr="/tmp/tmpm33eht53/01-what-the-judges-want-1.png" id="22" name="Picture"/>
                     <pic:cNvPicPr>
                       <a:picLocks noChangeArrowheads="1" noChangeAspect="1"/>
                     </pic:cNvPicPr>
@@ -160,7 +160,7 @@
               <a:graphicData uri="http://schemas.openxmlformats.org/drawingml/2006/picture">
                 <pic:pic>
                   <pic:nvPicPr>
-                    <pic:cNvPr descr="/tmp/tmpb7fcviaa/01-what-the-judges-want-2.png" id="26" name="Picture"/>
+                    <pic:cNvPr descr="/tmp/tmpm33eht53/01-what-the-judges-want-2.png" id="26" name="Picture"/>
                     <pic:cNvPicPr>
                       <a:picLocks noChangeArrowheads="1" noChangeAspect="1"/>
                     </pic:cNvPicPr>
@@ -289,7 +289,7 @@
               <a:graphicData uri="http://schemas.openxmlformats.org/drawingml/2006/picture">
                 <pic:pic>
                   <pic:nvPicPr>
-                    <pic:cNvPr descr="/tmp/tmpb7fcviaa/01-what-the-judges-want-3.png" id="30" name="Picture"/>
+                    <pic:cNvPr descr="/tmp/tmpm33eht53/01-what-the-judges-want-3.png" id="30" name="Picture"/>
                     <pic:cNvPicPr>
                       <a:picLocks noChangeArrowheads="1" noChangeAspect="1"/>
                     </pic:cNvPicPr>
@@ -480,7 +480,7 @@
               <a:graphicData uri="http://schemas.openxmlformats.org/drawingml/2006/picture">
                 <pic:pic>
                   <pic:nvPicPr>
-                    <pic:cNvPr descr="/tmp/tmpb7fcviaa/01-what-the-judges-want-4.png" id="34" name="Picture"/>
+                    <pic:cNvPr descr="/tmp/tmpm33eht53/01-what-the-judges-want-4.png" id="34" name="Picture"/>
                     <pic:cNvPicPr>
                       <a:picLocks noChangeArrowheads="1" noChangeAspect="1"/>
                     </pic:cNvPicPr>
@@ -668,7 +668,13 @@
         <w:t xml:space="preserve"> </w:t>
       </w:r>
       <w:r>
-        <w:t xml:space="preserve">on-time delivery goes from 71% toward 96.6% in the data, cause by cause.</w:t>
+        <w:t xml:space="preserve">in the data, on-time delivery goes from 71% to about 90% with realistic fixes (99%</w:t>
+      </w:r>
+      <w:r>
+        <w:t xml:space="preserve"> </w:t>
+      </w:r>
+      <w:r>
+        <w:t xml:space="preserve">ceiling), cause by cause, with a test on months the rules never saw.</w:t>
       </w:r>
       <w:r>
         <w:t xml:space="preserve"> </w:t>
@@ -723,7 +729,7 @@
               <a:graphicData uri="http://schemas.openxmlformats.org/drawingml/2006/picture">
                 <pic:pic>
                   <pic:nvPicPr>
-                    <pic:cNvPr descr="/tmp/tmpb7fcviaa/01-what-the-judges-want-5.png" id="38" name="Picture"/>
+                    <pic:cNvPr descr="/tmp/tmpm33eht53/01-what-the-judges-want-5.png" id="38" name="Picture"/>
                     <pic:cNvPicPr>
                       <a:picLocks noChangeArrowheads="1" noChangeAspect="1"/>
                     </pic:cNvPicPr>

</xml_diff>

<commit_message>
Docs: screen-by-screen user guide with annotated screenshots
Every screen with numbered markers and a table explaining each part,
the 10-step order desk pipeline, the 12 sample emails (good and bad
cases), the address rule, the simulated WMS, where the AI is and which
framework, Gemini key setup and open blockers. README links START-HERE
and the guide; test counts updated; Word copies rebuilt.

Co-Authored-By: Claude Opus 5.5 <noreply@anthropic.com>
Claude-Session: https://claude.ai/code/session_018mJx5VLNFyHg3anBqqcAy7
</commit_message>
<xml_diff>
--- a/docs/downloads/01-what-the-judges-want.docx
+++ b/docs/downloads/01-what-the-judges-want.docx
@@ -42,7 +42,7 @@
               <a:graphicData uri="http://schemas.openxmlformats.org/drawingml/2006/picture">
                 <pic:pic>
                   <pic:nvPicPr>
-                    <pic:cNvPr descr="/tmp/tmpm33eht53/01-what-the-judges-want-1.png" id="22" name="Picture"/>
+                    <pic:cNvPr descr="/tmp/tmp57pkfi58/01-what-the-judges-want-1.png" id="22" name="Picture"/>
                     <pic:cNvPicPr>
                       <a:picLocks noChangeArrowheads="1" noChangeAspect="1"/>
                     </pic:cNvPicPr>
@@ -160,7 +160,7 @@
               <a:graphicData uri="http://schemas.openxmlformats.org/drawingml/2006/picture">
                 <pic:pic>
                   <pic:nvPicPr>
-                    <pic:cNvPr descr="/tmp/tmpm33eht53/01-what-the-judges-want-2.png" id="26" name="Picture"/>
+                    <pic:cNvPr descr="/tmp/tmp57pkfi58/01-what-the-judges-want-2.png" id="26" name="Picture"/>
                     <pic:cNvPicPr>
                       <a:picLocks noChangeArrowheads="1" noChangeAspect="1"/>
                     </pic:cNvPicPr>
@@ -289,7 +289,7 @@
               <a:graphicData uri="http://schemas.openxmlformats.org/drawingml/2006/picture">
                 <pic:pic>
                   <pic:nvPicPr>
-                    <pic:cNvPr descr="/tmp/tmpm33eht53/01-what-the-judges-want-3.png" id="30" name="Picture"/>
+                    <pic:cNvPr descr="/tmp/tmp57pkfi58/01-what-the-judges-want-3.png" id="30" name="Picture"/>
                     <pic:cNvPicPr>
                       <a:picLocks noChangeArrowheads="1" noChangeAspect="1"/>
                     </pic:cNvPicPr>
@@ -480,7 +480,7 @@
               <a:graphicData uri="http://schemas.openxmlformats.org/drawingml/2006/picture">
                 <pic:pic>
                   <pic:nvPicPr>
-                    <pic:cNvPr descr="/tmp/tmpm33eht53/01-what-the-judges-want-4.png" id="34" name="Picture"/>
+                    <pic:cNvPr descr="/tmp/tmp57pkfi58/01-what-the-judges-want-4.png" id="34" name="Picture"/>
                     <pic:cNvPicPr>
                       <a:picLocks noChangeArrowheads="1" noChangeAspect="1"/>
                     </pic:cNvPicPr>
@@ -729,7 +729,7 @@
               <a:graphicData uri="http://schemas.openxmlformats.org/drawingml/2006/picture">
                 <pic:pic>
                   <pic:nvPicPr>
-                    <pic:cNvPr descr="/tmp/tmpm33eht53/01-what-the-judges-want-5.png" id="38" name="Picture"/>
+                    <pic:cNvPr descr="/tmp/tmp57pkfi58/01-what-the-judges-want-5.png" id="38" name="Picture"/>
                     <pic:cNvPicPr>
                       <a:picLocks noChangeArrowheads="1" noChangeAspect="1"/>
                     </pic:cNvPicPr>

</xml_diff>